<commit_message>
Updated Game Design Doc
Updated Game Design Doc / GDD
</commit_message>
<xml_diff>
--- a/Docs/Disco Infernal GDD 2.docx
+++ b/Docs/Disco Infernal GDD 2.docx
@@ -345,7 +345,7 @@
           <w:noProof/>
         </w:rPr>
         <w:drawing>
-          <wp:inline distT="0" distB="0" distL="0" distR="0" wp14:anchorId="0CF46869" wp14:editId="67382948">
+          <wp:inline distT="0" distB="0" distL="0" distR="0" wp14:anchorId="0CF46869" wp14:editId="20A381D5">
             <wp:extent cx="4681738" cy="2731014"/>
             <wp:effectExtent l="0" t="0" r="5080" b="0"/>
             <wp:docPr id="1253275303" name="Picture 1"/>
@@ -1104,6 +1104,155 @@
     <w:p/>
     <w:bookmarkEnd w:id="0"/>
     <w:p/>
+    <w:p>
+      <w:pPr>
+        <w:pStyle w:val="Heading1"/>
+      </w:pPr>
+      <w:r>
+        <w:t>Collision Layers</w:t>
+      </w:r>
+    </w:p>
+    <w:p>
+      <w:pPr>
+        <w:pStyle w:val="ListParagraph"/>
+        <w:numPr>
+          <w:ilvl w:val="0"/>
+          <w:numId w:val="12"/>
+        </w:numPr>
+      </w:pPr>
+      <w:r>
+        <w:t>Layer 1</w:t>
+      </w:r>
+      <w:r>
+        <w:tab/>
+        <w:t>Physical Object</w:t>
+      </w:r>
+    </w:p>
+    <w:p>
+      <w:pPr>
+        <w:pStyle w:val="ListParagraph"/>
+        <w:numPr>
+          <w:ilvl w:val="0"/>
+          <w:numId w:val="12"/>
+        </w:numPr>
+      </w:pPr>
+      <w:r>
+        <w:t>Layer 2</w:t>
+      </w:r>
+      <w:r>
+        <w:tab/>
+        <w:t>Object that block talking</w:t>
+      </w:r>
+    </w:p>
+    <w:p>
+      <w:pPr>
+        <w:pStyle w:val="ListParagraph"/>
+        <w:numPr>
+          <w:ilvl w:val="0"/>
+          <w:numId w:val="12"/>
+        </w:numPr>
+      </w:pPr>
+      <w:r>
+        <w:t>Layer 4</w:t>
+      </w:r>
+      <w:r>
+        <w:tab/>
+        <w:t>Entities that can talk to the player</w:t>
+      </w:r>
+    </w:p>
+    <w:p/>
+    <w:p>
+      <w:pPr>
+        <w:pStyle w:val="Heading1"/>
+      </w:pPr>
+      <w:r>
+        <w:t>Interface Buttons and Keys</w:t>
+      </w:r>
+    </w:p>
+    <w:p>
+      <w:pPr>
+        <w:pStyle w:val="ListParagraph"/>
+        <w:numPr>
+          <w:ilvl w:val="0"/>
+          <w:numId w:val="13"/>
+        </w:numPr>
+        <w:tabs>
+          <w:tab w:val="left" w:pos="2268"/>
+        </w:tabs>
+      </w:pPr>
+      <w:r>
+        <w:t>Movement</w:t>
+      </w:r>
+      <w:r>
+        <w:tab/>
+        <w:t>WASD</w:t>
+      </w:r>
+    </w:p>
+    <w:p>
+      <w:pPr>
+        <w:pStyle w:val="ListParagraph"/>
+        <w:numPr>
+          <w:ilvl w:val="0"/>
+          <w:numId w:val="13"/>
+        </w:numPr>
+        <w:tabs>
+          <w:tab w:val="left" w:pos="2268"/>
+        </w:tabs>
+      </w:pPr>
+      <w:r>
+        <w:t>Talking</w:t>
+      </w:r>
+      <w:r>
+        <w:tab/>
+        <w:t>T</w:t>
+      </w:r>
+    </w:p>
+    <w:p>
+      <w:pPr>
+        <w:pStyle w:val="ListParagraph"/>
+        <w:numPr>
+          <w:ilvl w:val="0"/>
+          <w:numId w:val="13"/>
+        </w:numPr>
+        <w:tabs>
+          <w:tab w:val="left" w:pos="2268"/>
+        </w:tabs>
+      </w:pPr>
+      <w:r>
+        <w:t>Aiming</w:t>
+      </w:r>
+      <w:r>
+        <w:tab/>
+        <w:t>Right-Click + mouse pointer to aim</w:t>
+      </w:r>
+    </w:p>
+    <w:p>
+      <w:pPr>
+        <w:pStyle w:val="ListParagraph"/>
+        <w:numPr>
+          <w:ilvl w:val="0"/>
+          <w:numId w:val="13"/>
+        </w:numPr>
+        <w:tabs>
+          <w:tab w:val="left" w:pos="2268"/>
+        </w:tabs>
+      </w:pPr>
+      <w:r>
+        <w:t>Inventory</w:t>
+      </w:r>
+      <w:r>
+        <w:tab/>
+        <w:t>I</w:t>
+      </w:r>
+    </w:p>
+    <w:p>
+      <w:pPr>
+        <w:tabs>
+          <w:tab w:val="left" w:pos="2268"/>
+        </w:tabs>
+      </w:pPr>
+    </w:p>
+    <w:p/>
     <w:sectPr>
       <w:pgSz w:w="11906" w:h="16838"/>
       <w:pgMar w:top="1440" w:right="1440" w:bottom="1440" w:left="1440" w:header="708" w:footer="708" w:gutter="0"/>
@@ -1997,6 +2146,119 @@
     </w:lvl>
   </w:abstractNum>
   <w:abstractNum w:abstractNumId="8" w15:restartNumberingAfterBreak="0">
+    <w:nsid w:val="6363278C"/>
+    <w:multiLevelType w:val="hybridMultilevel"/>
+    <w:tmpl w:val="A7D2C656"/>
+    <w:lvl w:ilvl="0" w:tplc="08090001">
+      <w:start w:val="1"/>
+      <w:numFmt w:val="bullet"/>
+      <w:lvlText w:val=""/>
+      <w:lvlJc w:val="left"/>
+      <w:pPr>
+        <w:ind w:left="720" w:hanging="360"/>
+      </w:pPr>
+      <w:rPr>
+        <w:rFonts w:ascii="Symbol" w:hAnsi="Symbol" w:hint="default"/>
+      </w:rPr>
+    </w:lvl>
+    <w:lvl w:ilvl="1" w:tplc="08090003" w:tentative="1">
+      <w:start w:val="1"/>
+      <w:numFmt w:val="bullet"/>
+      <w:lvlText w:val="o"/>
+      <w:lvlJc w:val="left"/>
+      <w:pPr>
+        <w:ind w:left="1440" w:hanging="360"/>
+      </w:pPr>
+      <w:rPr>
+        <w:rFonts w:ascii="Courier New" w:hAnsi="Courier New" w:cs="Courier New" w:hint="default"/>
+      </w:rPr>
+    </w:lvl>
+    <w:lvl w:ilvl="2" w:tplc="08090005" w:tentative="1">
+      <w:start w:val="1"/>
+      <w:numFmt w:val="bullet"/>
+      <w:lvlText w:val=""/>
+      <w:lvlJc w:val="left"/>
+      <w:pPr>
+        <w:ind w:left="2160" w:hanging="360"/>
+      </w:pPr>
+      <w:rPr>
+        <w:rFonts w:ascii="Wingdings" w:hAnsi="Wingdings" w:hint="default"/>
+      </w:rPr>
+    </w:lvl>
+    <w:lvl w:ilvl="3" w:tplc="08090001" w:tentative="1">
+      <w:start w:val="1"/>
+      <w:numFmt w:val="bullet"/>
+      <w:lvlText w:val=""/>
+      <w:lvlJc w:val="left"/>
+      <w:pPr>
+        <w:ind w:left="2880" w:hanging="360"/>
+      </w:pPr>
+      <w:rPr>
+        <w:rFonts w:ascii="Symbol" w:hAnsi="Symbol" w:hint="default"/>
+      </w:rPr>
+    </w:lvl>
+    <w:lvl w:ilvl="4" w:tplc="08090003" w:tentative="1">
+      <w:start w:val="1"/>
+      <w:numFmt w:val="bullet"/>
+      <w:lvlText w:val="o"/>
+      <w:lvlJc w:val="left"/>
+      <w:pPr>
+        <w:ind w:left="3600" w:hanging="360"/>
+      </w:pPr>
+      <w:rPr>
+        <w:rFonts w:ascii="Courier New" w:hAnsi="Courier New" w:cs="Courier New" w:hint="default"/>
+      </w:rPr>
+    </w:lvl>
+    <w:lvl w:ilvl="5" w:tplc="08090005" w:tentative="1">
+      <w:start w:val="1"/>
+      <w:numFmt w:val="bullet"/>
+      <w:lvlText w:val=""/>
+      <w:lvlJc w:val="left"/>
+      <w:pPr>
+        <w:ind w:left="4320" w:hanging="360"/>
+      </w:pPr>
+      <w:rPr>
+        <w:rFonts w:ascii="Wingdings" w:hAnsi="Wingdings" w:hint="default"/>
+      </w:rPr>
+    </w:lvl>
+    <w:lvl w:ilvl="6" w:tplc="08090001" w:tentative="1">
+      <w:start w:val="1"/>
+      <w:numFmt w:val="bullet"/>
+      <w:lvlText w:val=""/>
+      <w:lvlJc w:val="left"/>
+      <w:pPr>
+        <w:ind w:left="5040" w:hanging="360"/>
+      </w:pPr>
+      <w:rPr>
+        <w:rFonts w:ascii="Symbol" w:hAnsi="Symbol" w:hint="default"/>
+      </w:rPr>
+    </w:lvl>
+    <w:lvl w:ilvl="7" w:tplc="08090003" w:tentative="1">
+      <w:start w:val="1"/>
+      <w:numFmt w:val="bullet"/>
+      <w:lvlText w:val="o"/>
+      <w:lvlJc w:val="left"/>
+      <w:pPr>
+        <w:ind w:left="5760" w:hanging="360"/>
+      </w:pPr>
+      <w:rPr>
+        <w:rFonts w:ascii="Courier New" w:hAnsi="Courier New" w:cs="Courier New" w:hint="default"/>
+      </w:rPr>
+    </w:lvl>
+    <w:lvl w:ilvl="8" w:tplc="08090005" w:tentative="1">
+      <w:start w:val="1"/>
+      <w:numFmt w:val="bullet"/>
+      <w:lvlText w:val=""/>
+      <w:lvlJc w:val="left"/>
+      <w:pPr>
+        <w:ind w:left="6480" w:hanging="360"/>
+      </w:pPr>
+      <w:rPr>
+        <w:rFonts w:ascii="Wingdings" w:hAnsi="Wingdings" w:hint="default"/>
+      </w:rPr>
+    </w:lvl>
+  </w:abstractNum>
+  <w:abstractNum w:abstractNumId="9" w15:restartNumberingAfterBreak="0">
     <w:nsid w:val="690D7820"/>
     <w:multiLevelType w:val="hybridMultilevel"/>
     <w:tmpl w:val="5FA49602"/>
@@ -2109,7 +2371,7 @@
       </w:rPr>
     </w:lvl>
   </w:abstractNum>
-  <w:abstractNum w:abstractNumId="9" w15:restartNumberingAfterBreak="0">
+  <w:abstractNum w:abstractNumId="10" w15:restartNumberingAfterBreak="0">
     <w:nsid w:val="6CFB20C9"/>
     <w:multiLevelType w:val="hybridMultilevel"/>
     <w:tmpl w:val="D682BB2C"/>
@@ -2222,7 +2484,7 @@
       </w:rPr>
     </w:lvl>
   </w:abstractNum>
-  <w:abstractNum w:abstractNumId="10" w15:restartNumberingAfterBreak="0">
+  <w:abstractNum w:abstractNumId="11" w15:restartNumberingAfterBreak="0">
     <w:nsid w:val="716867A6"/>
     <w:multiLevelType w:val="hybridMultilevel"/>
     <w:tmpl w:val="62AE300A"/>
@@ -2311,8 +2573,121 @@
       </w:pPr>
     </w:lvl>
   </w:abstractNum>
+  <w:abstractNum w:abstractNumId="12" w15:restartNumberingAfterBreak="0">
+    <w:nsid w:val="743D2ADA"/>
+    <w:multiLevelType w:val="hybridMultilevel"/>
+    <w:tmpl w:val="6D9EE714"/>
+    <w:lvl w:ilvl="0" w:tplc="08090001">
+      <w:start w:val="1"/>
+      <w:numFmt w:val="bullet"/>
+      <w:lvlText w:val=""/>
+      <w:lvlJc w:val="left"/>
+      <w:pPr>
+        <w:ind w:left="720" w:hanging="360"/>
+      </w:pPr>
+      <w:rPr>
+        <w:rFonts w:ascii="Symbol" w:hAnsi="Symbol" w:hint="default"/>
+      </w:rPr>
+    </w:lvl>
+    <w:lvl w:ilvl="1" w:tplc="08090003" w:tentative="1">
+      <w:start w:val="1"/>
+      <w:numFmt w:val="bullet"/>
+      <w:lvlText w:val="o"/>
+      <w:lvlJc w:val="left"/>
+      <w:pPr>
+        <w:ind w:left="1440" w:hanging="360"/>
+      </w:pPr>
+      <w:rPr>
+        <w:rFonts w:ascii="Courier New" w:hAnsi="Courier New" w:cs="Courier New" w:hint="default"/>
+      </w:rPr>
+    </w:lvl>
+    <w:lvl w:ilvl="2" w:tplc="08090005" w:tentative="1">
+      <w:start w:val="1"/>
+      <w:numFmt w:val="bullet"/>
+      <w:lvlText w:val=""/>
+      <w:lvlJc w:val="left"/>
+      <w:pPr>
+        <w:ind w:left="2160" w:hanging="360"/>
+      </w:pPr>
+      <w:rPr>
+        <w:rFonts w:ascii="Wingdings" w:hAnsi="Wingdings" w:hint="default"/>
+      </w:rPr>
+    </w:lvl>
+    <w:lvl w:ilvl="3" w:tplc="08090001" w:tentative="1">
+      <w:start w:val="1"/>
+      <w:numFmt w:val="bullet"/>
+      <w:lvlText w:val=""/>
+      <w:lvlJc w:val="left"/>
+      <w:pPr>
+        <w:ind w:left="2880" w:hanging="360"/>
+      </w:pPr>
+      <w:rPr>
+        <w:rFonts w:ascii="Symbol" w:hAnsi="Symbol" w:hint="default"/>
+      </w:rPr>
+    </w:lvl>
+    <w:lvl w:ilvl="4" w:tplc="08090003" w:tentative="1">
+      <w:start w:val="1"/>
+      <w:numFmt w:val="bullet"/>
+      <w:lvlText w:val="o"/>
+      <w:lvlJc w:val="left"/>
+      <w:pPr>
+        <w:ind w:left="3600" w:hanging="360"/>
+      </w:pPr>
+      <w:rPr>
+        <w:rFonts w:ascii="Courier New" w:hAnsi="Courier New" w:cs="Courier New" w:hint="default"/>
+      </w:rPr>
+    </w:lvl>
+    <w:lvl w:ilvl="5" w:tplc="08090005" w:tentative="1">
+      <w:start w:val="1"/>
+      <w:numFmt w:val="bullet"/>
+      <w:lvlText w:val=""/>
+      <w:lvlJc w:val="left"/>
+      <w:pPr>
+        <w:ind w:left="4320" w:hanging="360"/>
+      </w:pPr>
+      <w:rPr>
+        <w:rFonts w:ascii="Wingdings" w:hAnsi="Wingdings" w:hint="default"/>
+      </w:rPr>
+    </w:lvl>
+    <w:lvl w:ilvl="6" w:tplc="08090001" w:tentative="1">
+      <w:start w:val="1"/>
+      <w:numFmt w:val="bullet"/>
+      <w:lvlText w:val=""/>
+      <w:lvlJc w:val="left"/>
+      <w:pPr>
+        <w:ind w:left="5040" w:hanging="360"/>
+      </w:pPr>
+      <w:rPr>
+        <w:rFonts w:ascii="Symbol" w:hAnsi="Symbol" w:hint="default"/>
+      </w:rPr>
+    </w:lvl>
+    <w:lvl w:ilvl="7" w:tplc="08090003" w:tentative="1">
+      <w:start w:val="1"/>
+      <w:numFmt w:val="bullet"/>
+      <w:lvlText w:val="o"/>
+      <w:lvlJc w:val="left"/>
+      <w:pPr>
+        <w:ind w:left="5760" w:hanging="360"/>
+      </w:pPr>
+      <w:rPr>
+        <w:rFonts w:ascii="Courier New" w:hAnsi="Courier New" w:cs="Courier New" w:hint="default"/>
+      </w:rPr>
+    </w:lvl>
+    <w:lvl w:ilvl="8" w:tplc="08090005" w:tentative="1">
+      <w:start w:val="1"/>
+      <w:numFmt w:val="bullet"/>
+      <w:lvlText w:val=""/>
+      <w:lvlJc w:val="left"/>
+      <w:pPr>
+        <w:ind w:left="6480" w:hanging="360"/>
+      </w:pPr>
+      <w:rPr>
+        <w:rFonts w:ascii="Wingdings" w:hAnsi="Wingdings" w:hint="default"/>
+      </w:rPr>
+    </w:lvl>
+  </w:abstractNum>
   <w:num w:numId="1" w16cid:durableId="1803303116">
-    <w:abstractNumId w:val="10"/>
+    <w:abstractNumId w:val="11"/>
   </w:num>
   <w:num w:numId="2" w16cid:durableId="1262375663">
     <w:abstractNumId w:val="5"/>
@@ -2321,7 +2696,7 @@
     <w:abstractNumId w:val="0"/>
   </w:num>
   <w:num w:numId="4" w16cid:durableId="1567908722">
-    <w:abstractNumId w:val="8"/>
+    <w:abstractNumId w:val="9"/>
   </w:num>
   <w:num w:numId="5" w16cid:durableId="1131747073">
     <w:abstractNumId w:val="6"/>
@@ -2342,7 +2717,13 @@
     <w:abstractNumId w:val="4"/>
   </w:num>
   <w:num w:numId="11" w16cid:durableId="1987926981">
-    <w:abstractNumId w:val="9"/>
+    <w:abstractNumId w:val="10"/>
+  </w:num>
+  <w:num w:numId="12" w16cid:durableId="1159999656">
+    <w:abstractNumId w:val="8"/>
+  </w:num>
+  <w:num w:numId="13" w16cid:durableId="1405955724">
+    <w:abstractNumId w:val="12"/>
   </w:num>
 </w:numbering>
 </file>

</xml_diff>

<commit_message>
Update scenes, scripts, docs, and add dancer walkable area
</commit_message>
<xml_diff>
--- a/Docs/Disco Infernal GDD 2.docx
+++ b/Docs/Disco Infernal GDD 2.docx
@@ -1452,7 +1452,17 @@
       </w:r>
       <w:r>
         <w:rPr/>
-        <w:t xml:space="preserve">, tracked on HUD). While latent and invisible in the basement, he </w:t>
+        <w:t xml:space="preserve">, tracked on HUD). Starts the night latent in the basement with </w:t>
+      </w:r>
+      <w:r>
+        <w:rPr>
+          <w:shd w:fill="81D41A" w:val="clear"/>
+        </w:rPr>
+        <w:t>15</w:t>
+      </w:r>
+      <w:r>
+        <w:rPr/>
+        <w:t xml:space="preserve"> filled energy, he </w:t>
       </w:r>
       <w:r>
         <w:rPr>
@@ -1562,7 +1572,7 @@
       </w:r>
       <w:r>
         <w:rPr/>
-        <w:t>, he fades out, turns invisible, and resumes recharging.</w:t>
+        <w:t>, he fades out, turns invisible, returns to basement origin and resumes recharging.</w:t>
       </w:r>
     </w:p>
     <w:p>
@@ -1615,6 +1625,218 @@
       <w:r>
         <w:rPr/>
         <w:t>) continuously pushes them aside, allowing him to push through crowded dance floors and narrow corridors unhindered.</w:t>
+      </w:r>
+    </w:p>
+    <w:p>
+      <w:pPr>
+        <w:pStyle w:val="ListParagraph"/>
+        <w:numPr>
+          <w:ilvl w:val="0"/>
+          <w:numId w:val="11"/>
+        </w:numPr>
+        <w:spacing w:before="0" w:after="160"/>
+        <w:contextualSpacing/>
+        <w:rPr/>
+      </w:pPr>
+      <w:r>
+        <w:rPr>
+          <w:b/>
+          <w:bCs/>
+        </w:rPr>
+        <w:t>Mr Boogie-Woogie Ghost Summoning:</w:t>
+      </w:r>
+      <w:r>
+        <w:rPr/>
+        <w:t xml:space="preserve"> While active in </w:t>
+      </w:r>
+      <w:r>
+        <w:rPr>
+          <w:shd w:fill="81D41A" w:val="clear"/>
+        </w:rPr>
+        <w:t>NORMAL</w:t>
+      </w:r>
+      <w:r>
+        <w:rPr/>
+        <w:t xml:space="preserve"> state, Boogie has a </w:t>
+      </w:r>
+      <w:r>
+        <w:rPr>
+          <w:shd w:fill="81D41A" w:val="clear"/>
+        </w:rPr>
+        <w:t>random</w:t>
+      </w:r>
+      <w:r>
+        <w:rPr/>
+        <w:t xml:space="preserve"> chance per frame to summon a ghost. Consumes </w:t>
+      </w:r>
+      <w:r>
+        <w:rPr>
+          <w:shd w:fill="81D41A" w:val="clear"/>
+        </w:rPr>
+        <w:t>5</w:t>
+      </w:r>
+      <w:r>
+        <w:rPr/>
+        <w:t xml:space="preserve"> energy per summon. Process takes </w:t>
+      </w:r>
+      <w:r>
+        <w:rPr>
+          <w:shd w:fill="81D41A" w:val="clear"/>
+        </w:rPr>
+        <w:t>~1.0s</w:t>
+      </w:r>
+      <w:r>
+        <w:rPr/>
+        <w:t xml:space="preserve">: halts movement, plays summon animation, expands summon aura (0.7s expand, 0.3s shrink), spawns a ghost </w:t>
+      </w:r>
+      <w:r>
+        <w:rPr>
+          <w:shd w:fill="81D41A" w:val="clear"/>
+        </w:rPr>
+        <w:t>30</w:t>
+      </w:r>
+      <w:r>
+        <w:rPr/>
+        <w:t xml:space="preserve"> units away in a random direction, then resumes normal movement.</w:t>
+      </w:r>
+    </w:p>
+    <w:p>
+      <w:pPr>
+        <w:pStyle w:val="ListParagraph"/>
+        <w:numPr>
+          <w:ilvl w:val="0"/>
+          <w:numId w:val="11"/>
+        </w:numPr>
+        <w:spacing w:before="0" w:after="160"/>
+        <w:contextualSpacing/>
+        <w:rPr/>
+      </w:pPr>
+      <w:r>
+        <w:rPr>
+          <w:b/>
+          <w:bCs/>
+        </w:rPr>
+        <w:t>Ghost Materialization &amp; Appearance:</w:t>
+      </w:r>
+      <w:r>
+        <w:rPr/>
+        <w:t xml:space="preserve"> Spawns latent and materializes via shader dissolve effect over </w:t>
+      </w:r>
+      <w:r>
+        <w:rPr>
+          <w:shd w:fill="81D41A" w:val="clear"/>
+        </w:rPr>
+        <w:t>1.0</w:t>
+      </w:r>
+      <w:r>
+        <w:rPr/>
+        <w:t xml:space="preserve"> second. Movement and actions are locked during this appearance phase.</w:t>
+      </w:r>
+    </w:p>
+    <w:p>
+      <w:pPr>
+        <w:pStyle w:val="ListParagraph"/>
+        <w:numPr>
+          <w:ilvl w:val="0"/>
+          <w:numId w:val="11"/>
+        </w:numPr>
+        <w:spacing w:before="0" w:after="160"/>
+        <w:contextualSpacing/>
+        <w:rPr/>
+      </w:pPr>
+      <w:r>
+        <w:rPr>
+          <w:b/>
+          <w:bCs/>
+        </w:rPr>
+        <w:t>Ghost Targeting &amp; Retargeting:</w:t>
+      </w:r>
+      <w:r>
+        <w:rPr/>
+        <w:t xml:space="preserve"> After materializing, acquires a </w:t>
+      </w:r>
+      <w:r>
+        <w:rPr>
+          <w:shd w:fill="81D41A" w:val="clear"/>
+        </w:rPr>
+        <w:t>random unpossessed</w:t>
+      </w:r>
+      <w:r>
+        <w:rPr/>
+        <w:t xml:space="preserve"> target (Player or Dancer) and travel to target via pathfinding. If current target becomes possessed or is being possessed by another ghost, immediately retargets to the next available unpossessed dancer.</w:t>
+      </w:r>
+    </w:p>
+    <w:p>
+      <w:pPr>
+        <w:pStyle w:val="ListParagraph"/>
+        <w:numPr>
+          <w:ilvl w:val="0"/>
+          <w:numId w:val="11"/>
+        </w:numPr>
+        <w:spacing w:before="0" w:after="160"/>
+        <w:contextualSpacing/>
+        <w:rPr/>
+      </w:pPr>
+      <w:r>
+        <w:rPr>
+          <w:b/>
+          <w:bCs/>
+        </w:rPr>
+        <w:t>Dancer Possession Transition:</w:t>
+      </w:r>
+      <w:r>
+        <w:rPr/>
+        <w:t xml:space="preserve"> Triggered when a ghost reaches within </w:t>
+      </w:r>
+      <w:r>
+        <w:rPr>
+          <w:shd w:fill="81D41A" w:val="clear"/>
+        </w:rPr>
+        <w:t>10 units</w:t>
+      </w:r>
+      <w:r>
+        <w:rPr/>
+        <w:t xml:space="preserve"> of a dancer and channels for </w:t>
+      </w:r>
+      <w:r>
+        <w:rPr>
+          <w:shd w:fill="81D41A" w:val="clear"/>
+        </w:rPr>
+        <w:t>2.0 seconds</w:t>
+      </w:r>
+      <w:r>
+        <w:rPr/>
+        <w:t xml:space="preserve">: (1) </w:t>
+      </w:r>
+      <w:r>
+        <w:rPr>
+          <w:shd w:fill="81D41A" w:val="clear"/>
+        </w:rPr>
+        <w:t>Rapid Flashing</w:t>
+      </w:r>
+      <w:r>
+        <w:rPr/>
+        <w:t xml:space="preserve">: Alternates normal and possessed sprites with accelerating frequency (interval decreases from 0.28s to 0.03s via Quad In easing). (2) </w:t>
+      </w:r>
+      <w:r>
+        <w:rPr>
+          <w:shd w:fill="81D41A" w:val="clear"/>
+        </w:rPr>
+        <w:t>Shaking</w:t>
+      </w:r>
+      <w:r>
+        <w:rPr/>
+        <w:t xml:space="preserve">: During the final 40% of duration (last 0.8s), sprite jitters with increasing intensity (up to 2.5px offset). (3) </w:t>
+      </w:r>
+      <w:r>
+        <w:rPr>
+          <w:shd w:fill="81D41A" w:val="clear"/>
+        </w:rPr>
+        <w:t>Completion</w:t>
+      </w:r>
+      <w:r>
+        <w:rPr/>
+        <w:t>: Dancer permanently turns into a Possessed Dancer. (TODO: Aborts if interrupted or ghost leaves range.)</w:t>
       </w:r>
     </w:p>
     <w:sectPr>

</xml_diff>